<commit_message>
Sprint 2D.3 review: make ScenarioAction.id semantic (identity, not position)
Action ids were positional (<scenarioId>:<index>). Per review, an object must
have exactly ONE identity and it must never be positional — the same rule that
turned title -> scenarioId. So ScenarioAction.id is now the step's business
meaning <scenarioId>.<action>.<target> (e.g. auth-pos-valid.click.login_button),
with a deterministic #n suffix on collisions, exactly like assertion ids.

The <action>.<target> shape is INLINED in materializeActionTemplate; there is no
separate exported slug helper. Renderer sorts by order and switches on action,
never reads id, so emitted Playwright is unchanged (golden .spec byte-identical).
No schema-version bump: id is opaque stable identity, its internal format is not
part of the consumer contract — same precedent as the semantic assertion-id change.

tsc clean; 119 tests pass (added id-survives-reordering + #n dedupe cases).
</commit_message>
<xml_diff>
--- a/docs/EXECUTION_GRAPH_CONTRACT.docx
+++ b/docs/EXECUTION_GRAPH_CONTRACT.docx
@@ -1015,7 +1015,112 @@
         <w:rPr>
           <w:rStyle w:val="CommentTok"/>
         </w:rPr>
-        <w:t xml:space="preserve">// stable identity for this step within the node</w:t>
+        <w:t xml:space="preserve">// STABLE SEMANTIC identity — `&lt;scenarioId&gt;.&lt;action&gt;.&lt;target&gt;`</w:t>
+      </w:r>
+      <w:r>
+        <w:br/>
+      </w:r>
+      <w:r>
+        <w:rPr>
+          <w:rStyle w:val="NormalTok"/>
+        </w:rPr>
+        <w:t xml:space="preserve">                              </w:t>
+      </w:r>
+      <w:r>
+        <w:rPr>
+          <w:rStyle w:val="CommentTok"/>
+        </w:rPr>
+        <w:t xml:space="preserve">//   (e.g. `auth-pos-valid.click.login_button`). DERIVED FROM</w:t>
+      </w:r>
+      <w:r>
+        <w:br/>
+      </w:r>
+      <w:r>
+        <w:rPr>
+          <w:rStyle w:val="NormalTok"/>
+        </w:rPr>
+        <w:t xml:space="preserve">                              </w:t>
+      </w:r>
+      <w:r>
+        <w:rPr>
+          <w:rStyle w:val="CommentTok"/>
+        </w:rPr>
+        <w:t xml:space="preserve">//   MEANING, never from array position — so diffs / healing /</w:t>
+      </w:r>
+      <w:r>
+        <w:br/>
+      </w:r>
+      <w:r>
+        <w:rPr>
+          <w:rStyle w:val="NormalTok"/>
+        </w:rPr>
+        <w:t xml:space="preserve">                              </w:t>
+      </w:r>
+      <w:r>
+        <w:rPr>
+          <w:rStyle w:val="CommentTok"/>
+        </w:rPr>
+        <w:t xml:space="preserve">//   replay / analytics can reference a step durably even when</w:t>
+      </w:r>
+      <w:r>
+        <w:br/>
+      </w:r>
+      <w:r>
+        <w:rPr>
+          <w:rStyle w:val="NormalTok"/>
+        </w:rPr>
+        <w:t xml:space="preserve">                              </w:t>
+      </w:r>
+      <w:r>
+        <w:rPr>
+          <w:rStyle w:val="CommentTok"/>
+        </w:rPr>
+        <w:t xml:space="preserve">//   `order` changes, and an assertion's `afterAction` points at</w:t>
+      </w:r>
+      <w:r>
+        <w:br/>
+      </w:r>
+      <w:r>
+        <w:rPr>
+          <w:rStyle w:val="NormalTok"/>
+        </w:rPr>
+        <w:t xml:space="preserve">                              </w:t>
+      </w:r>
+      <w:r>
+        <w:rPr>
+          <w:rStyle w:val="CommentTok"/>
+        </w:rPr>
+        <w:t xml:space="preserve">//   exactly this value. Collisions within a node get a</w:t>
+      </w:r>
+      <w:r>
+        <w:br/>
+      </w:r>
+      <w:r>
+        <w:rPr>
+          <w:rStyle w:val="NormalTok"/>
+        </w:rPr>
+        <w:t xml:space="preserve">                              </w:t>
+      </w:r>
+      <w:r>
+        <w:rPr>
+          <w:rStyle w:val="CommentTok"/>
+        </w:rPr>
+        <w:t xml:space="preserve">//   deterministic `#2`/`#3` suffix. ONE identity per step — no</w:t>
+      </w:r>
+      <w:r>
+        <w:br/>
+      </w:r>
+      <w:r>
+        <w:rPr>
+          <w:rStyle w:val="NormalTok"/>
+        </w:rPr>
+        <w:t xml:space="preserve">                              </w:t>
+      </w:r>
+      <w:r>
+        <w:rPr>
+          <w:rStyle w:val="CommentTok"/>
+        </w:rPr>
+        <w:t xml:space="preserve">//   separate slug/derived key.</w:t>
       </w:r>
       <w:r>
         <w:br/>
@@ -1030,7 +1135,22 @@
         <w:rPr>
           <w:rStyle w:val="CommentTok"/>
         </w:rPr>
-        <w:t xml:space="preserve">// 0-based execution order (array is authoritative)</w:t>
+        <w:t xml:space="preserve">// 0-based execution order (array is authoritative for SEQUENCE</w:t>
+      </w:r>
+      <w:r>
+        <w:br/>
+      </w:r>
+      <w:r>
+        <w:rPr>
+          <w:rStyle w:val="NormalTok"/>
+        </w:rPr>
+        <w:t xml:space="preserve">                              </w:t>
+      </w:r>
+      <w:r>
+        <w:rPr>
+          <w:rStyle w:val="CommentTok"/>
+        </w:rPr>
+        <w:t xml:space="preserve">//   only — identity lives in `id`, NOT here)</w:t>
       </w:r>
       <w:r>
         <w:br/>

</xml_diff>

<commit_message>
Sprint 2D.4 review: link each assertion to its producing action (afterAction)
Every graph object has exactly one identity. An assertion may carry
afterAction, holding the producing action's EXACT ScenarioAction.id
(<scenarioId>.<action>.<target>, e.g. auth-pos-valid.click.login_button) —
the same string stored in actions[].id, never an index, never a derived slug.
The KB authors it verbatim and consumers join by plain equality:
node.actions.find(a => a.id === afterAction) — no helper, no computation.

- qa-knowledge-engine: 11 afterAction values are full action.ids
- scenario-graph-builder: copies afterAction verbatim (no actionSlug helper)
- scenario-graph: afterAction doc = exact action.id, one identity everywhere
- tests: invariant + 2D.4 + requirement-golden join via a.id === afterAction
- contract doc §6 + prose describe the direct action.id reference

Validation: 144 jest + 3 snapshots, 29/0 fidelity, 22/22 coverage; goldens
byte-identical (no snapshot churn).
</commit_message>
<xml_diff>
--- a/docs/EXECUTION_GRAPH_CONTRACT.docx
+++ b/docs/EXECUTION_GRAPH_CONTRACT.docx
@@ -1015,7 +1015,112 @@
         <w:rPr>
           <w:rStyle w:val="CommentTok"/>
         </w:rPr>
-        <w:t xml:space="preserve">// stable identity for this step within the node</w:t>
+        <w:t xml:space="preserve">// STABLE SEMANTIC identity — `&lt;scenarioId&gt;.&lt;action&gt;.&lt;target&gt;`</w:t>
+      </w:r>
+      <w:r>
+        <w:br/>
+      </w:r>
+      <w:r>
+        <w:rPr>
+          <w:rStyle w:val="NormalTok"/>
+        </w:rPr>
+        <w:t xml:space="preserve">                              </w:t>
+      </w:r>
+      <w:r>
+        <w:rPr>
+          <w:rStyle w:val="CommentTok"/>
+        </w:rPr>
+        <w:t xml:space="preserve">//   (e.g. `auth-pos-valid.click.login_button`). DERIVED FROM</w:t>
+      </w:r>
+      <w:r>
+        <w:br/>
+      </w:r>
+      <w:r>
+        <w:rPr>
+          <w:rStyle w:val="NormalTok"/>
+        </w:rPr>
+        <w:t xml:space="preserve">                              </w:t>
+      </w:r>
+      <w:r>
+        <w:rPr>
+          <w:rStyle w:val="CommentTok"/>
+        </w:rPr>
+        <w:t xml:space="preserve">//   MEANING, never from array position — so diffs / healing /</w:t>
+      </w:r>
+      <w:r>
+        <w:br/>
+      </w:r>
+      <w:r>
+        <w:rPr>
+          <w:rStyle w:val="NormalTok"/>
+        </w:rPr>
+        <w:t xml:space="preserve">                              </w:t>
+      </w:r>
+      <w:r>
+        <w:rPr>
+          <w:rStyle w:val="CommentTok"/>
+        </w:rPr>
+        <w:t xml:space="preserve">//   replay / analytics can reference a step durably even when</w:t>
+      </w:r>
+      <w:r>
+        <w:br/>
+      </w:r>
+      <w:r>
+        <w:rPr>
+          <w:rStyle w:val="NormalTok"/>
+        </w:rPr>
+        <w:t xml:space="preserve">                              </w:t>
+      </w:r>
+      <w:r>
+        <w:rPr>
+          <w:rStyle w:val="CommentTok"/>
+        </w:rPr>
+        <w:t xml:space="preserve">//   `order` changes, and an assertion's `afterAction` points at</w:t>
+      </w:r>
+      <w:r>
+        <w:br/>
+      </w:r>
+      <w:r>
+        <w:rPr>
+          <w:rStyle w:val="NormalTok"/>
+        </w:rPr>
+        <w:t xml:space="preserve">                              </w:t>
+      </w:r>
+      <w:r>
+        <w:rPr>
+          <w:rStyle w:val="CommentTok"/>
+        </w:rPr>
+        <w:t xml:space="preserve">//   exactly this value. Collisions within a node get a</w:t>
+      </w:r>
+      <w:r>
+        <w:br/>
+      </w:r>
+      <w:r>
+        <w:rPr>
+          <w:rStyle w:val="NormalTok"/>
+        </w:rPr>
+        <w:t xml:space="preserve">                              </w:t>
+      </w:r>
+      <w:r>
+        <w:rPr>
+          <w:rStyle w:val="CommentTok"/>
+        </w:rPr>
+        <w:t xml:space="preserve">//   deterministic `#2`/`#3` suffix. ONE identity per step — no</w:t>
+      </w:r>
+      <w:r>
+        <w:br/>
+      </w:r>
+      <w:r>
+        <w:rPr>
+          <w:rStyle w:val="NormalTok"/>
+        </w:rPr>
+        <w:t xml:space="preserve">                              </w:t>
+      </w:r>
+      <w:r>
+        <w:rPr>
+          <w:rStyle w:val="CommentTok"/>
+        </w:rPr>
+        <w:t xml:space="preserve">//   separate slug/derived key.</w:t>
       </w:r>
       <w:r>
         <w:br/>
@@ -1030,7 +1135,22 @@
         <w:rPr>
           <w:rStyle w:val="CommentTok"/>
         </w:rPr>
-        <w:t xml:space="preserve">// 0-based execution order (array is authoritative)</w:t>
+        <w:t xml:space="preserve">// 0-based execution order (array is authoritative for SEQUENCE</w:t>
+      </w:r>
+      <w:r>
+        <w:br/>
+      </w:r>
+      <w:r>
+        <w:rPr>
+          <w:rStyle w:val="NormalTok"/>
+        </w:rPr>
+        <w:t xml:space="preserve">                              </w:t>
+      </w:r>
+      <w:r>
+        <w:rPr>
+          <w:rStyle w:val="CommentTok"/>
+        </w:rPr>
+        <w:t xml:space="preserve">//   only — identity lives in `id`, NOT here)</w:t>
       </w:r>
       <w:r>
         <w:br/>
@@ -1574,6 +1694,153 @@
           <w:rStyle w:val="CommentTok"/>
         </w:rPr>
         <w:t xml:space="preserve">// check is skipped (count-guarded) when its target is absent</w:t>
+      </w:r>
+      <w:r>
+        <w:br/>
+      </w:r>
+      <w:r>
+        <w:rPr>
+          <w:rStyle w:val="NormalTok"/>
+        </w:rPr>
+        <w:t xml:space="preserve">    afterAction</w:t>
+      </w:r>
+      <w:r>
+        <w:rPr>
+          <w:rStyle w:val="OperatorTok"/>
+        </w:rPr>
+        <w:t xml:space="preserve">?</w:t>
+      </w:r>
+      <w:r>
+        <w:rPr>
+          <w:rStyle w:val="NormalTok"/>
+        </w:rPr>
+        <w:t xml:space="preserve">              </w:t>
+      </w:r>
+      <w:r>
+        <w:rPr>
+          <w:rStyle w:val="CommentTok"/>
+        </w:rPr>
+        <w:t xml:space="preserve">// The producing action's EXACT `id` (`&lt;scenarioId&gt;.&lt;action&gt;.</w:t>
+      </w:r>
+      <w:r>
+        <w:br/>
+      </w:r>
+      <w:r>
+        <w:rPr>
+          <w:rStyle w:val="NormalTok"/>
+        </w:rPr>
+        <w:t xml:space="preserve">                              </w:t>
+      </w:r>
+      <w:r>
+        <w:rPr>
+          <w:rStyle w:val="CommentTok"/>
+        </w:rPr>
+        <w:t xml:space="preserve">//   &lt;target&gt;`, e.g. `auth-pos-valid.click.login_button`) — the</w:t>
+      </w:r>
+      <w:r>
+        <w:br/>
+      </w:r>
+      <w:r>
+        <w:rPr>
+          <w:rStyle w:val="NormalTok"/>
+        </w:rPr>
+        <w:t xml:space="preserve">                              </w:t>
+      </w:r>
+      <w:r>
+        <w:rPr>
+          <w:rStyle w:val="CommentTok"/>
+        </w:rPr>
+        <w:t xml:space="preserve">//   SAME string stored in `actions[].id`, never an index, never a</w:t>
+      </w:r>
+      <w:r>
+        <w:br/>
+      </w:r>
+      <w:r>
+        <w:rPr>
+          <w:rStyle w:val="NormalTok"/>
+        </w:rPr>
+        <w:t xml:space="preserve">                              </w:t>
+      </w:r>
+      <w:r>
+        <w:rPr>
+          <w:rStyle w:val="CommentTok"/>
+        </w:rPr>
+        <w:t xml:space="preserve">//   derived slug. Answers "which step produced this outcome?" so</w:t>
+      </w:r>
+      <w:r>
+        <w:br/>
+      </w:r>
+      <w:r>
+        <w:rPr>
+          <w:rStyle w:val="NormalTok"/>
+        </w:rPr>
+        <w:t xml:space="preserve">                              </w:t>
+      </w:r>
+      <w:r>
+        <w:rPr>
+          <w:rStyle w:val="CommentTok"/>
+        </w:rPr>
+        <w:t xml:space="preserve">//   Replay / Healing / the execution timeline can say "after</w:t>
+      </w:r>
+      <w:r>
+        <w:br/>
+      </w:r>
+      <w:r>
+        <w:rPr>
+          <w:rStyle w:val="NormalTok"/>
+        </w:rPr>
+        <w:t xml:space="preserve">                              </w:t>
+      </w:r>
+      <w:r>
+        <w:rPr>
+          <w:rStyle w:val="CommentTok"/>
+        </w:rPr>
+        <w:t xml:space="preserve">//   clicking Login, expected the inventory page". Resolve by plain</w:t>
+      </w:r>
+      <w:r>
+        <w:br/>
+      </w:r>
+      <w:r>
+        <w:rPr>
+          <w:rStyle w:val="NormalTok"/>
+        </w:rPr>
+        <w:t xml:space="preserve">                              </w:t>
+      </w:r>
+      <w:r>
+        <w:rPr>
+          <w:rStyle w:val="CommentTok"/>
+        </w:rPr>
+        <w:t xml:space="preserve">//   equality: node.actions.find(a =&gt; a.id === afterAction) — no</w:t>
+      </w:r>
+      <w:r>
+        <w:br/>
+      </w:r>
+      <w:r>
+        <w:rPr>
+          <w:rStyle w:val="NormalTok"/>
+        </w:rPr>
+        <w:t xml:space="preserve">                              </w:t>
+      </w:r>
+      <w:r>
+        <w:rPr>
+          <w:rStyle w:val="CommentTok"/>
+        </w:rPr>
+        <w:t xml:space="preserve">//   helper, no computation. Absent when the check is not tied to a</w:t>
+      </w:r>
+      <w:r>
+        <w:br/>
+      </w:r>
+      <w:r>
+        <w:rPr>
+          <w:rStyle w:val="NormalTok"/>
+        </w:rPr>
+        <w:t xml:space="preserve">                              </w:t>
+      </w:r>
+      <w:r>
+        <w:rPr>
+          <w:rStyle w:val="CommentTok"/>
+        </w:rPr>
+        <w:t xml:space="preserve">//   materialized step.</w:t>
       </w:r>
       <w:r>
         <w:br/>
@@ -4629,70 +4896,190 @@
           <w:bCs/>
           <w:b/>
         </w:rPr>
-        <w:t xml:space="preserve">Assertions store CANONICAL business meaning, never Playwright.</w:t>
-      </w:r>
-      <w:r>
-        <w:t xml:space="preserve"> </w:t>
-      </w:r>
-      <w:r>
-        <w:t xml:space="preserve">The graph holds</w:t>
-      </w:r>
-      <w:r>
-        <w:t xml:space="preserve"> </w:t>
-      </w:r>
-      <w:r>
-        <w:rPr>
-          <w:rStyle w:val="VerbatimChar"/>
-        </w:rPr>
-        <w:t xml:space="preserve">{type:"visible",   target:"login_error"}</w:t>
-      </w:r>
-      <w:r>
-        <w:t xml:space="preserve">, never</w:t>
-      </w:r>
-      <w:r>
-        <w:t xml:space="preserve"> </w:t>
-      </w:r>
-      <w:r>
-        <w:rPr>
-          <w:rStyle w:val="VerbatimChar"/>
-        </w:rPr>
-        <w:t xml:space="preserve">expect(...)</w:t>
-      </w:r>
-      <w:r>
-        <w:t xml:space="preserve">,</w:t>
-      </w:r>
-      <w:r>
-        <w:t xml:space="preserve"> </w:t>
-      </w:r>
-      <w:r>
-        <w:rPr>
-          <w:rStyle w:val="VerbatimChar"/>
-        </w:rPr>
-        <w:t xml:space="preserve">toBeVisible()</w:t>
-      </w:r>
-      <w:r>
-        <w:t xml:space="preserve">, or a CSS locator. Script Gen is a pure</w:t>
-      </w:r>
-      <w:r>
-        <w:t xml:space="preserve"> </w:t>
-      </w:r>
-      <w:r>
-        <w:rPr>
-          <w:rStyle w:val="VerbatimChar"/>
-        </w:rPr>
-        <w:t xml:space="preserve">switch(type)</w:t>
-      </w:r>
-      <w:r>
-        <w:t xml:space="preserve"> </w:t>
-      </w:r>
-      <w:r>
-        <w:t xml:space="preserve">renderer + resolver — it NEVER infers an assertion from prose. The KB authors the check;</w:t>
-      </w:r>
-      <w:r>
-        <w:t xml:space="preserve"> </w:t>
-      </w:r>
-      <w:r>
-        <w:t xml:space="preserve">the graph carries it; the renderer grounds and emits it.</w:t>
+        <w:t xml:space="preserve">Every assertion knows which STEP produced it — by identity, not position.</w:t>
+      </w:r>
+      <w:r>
+        <w:t xml:space="preserve"> </w:t>
+      </w:r>
+      <w:r>
+        <w:t xml:space="preserve">An assertion may carry</w:t>
+      </w:r>
+      <w:r>
+        <w:t xml:space="preserve"> </w:t>
+      </w:r>
+      <w:r>
+        <w:rPr>
+          <w:rStyle w:val="VerbatimChar"/>
+        </w:rPr>
+        <w:t xml:space="preserve">afterAction</w:t>
+      </w:r>
+      <w:r>
+        <w:t xml:space="preserve">, holding the producing action’s EXACT</w:t>
+      </w:r>
+      <w:r>
+        <w:t xml:space="preserve"> </w:t>
+      </w:r>
+      <w:r>
+        <w:rPr>
+          <w:rStyle w:val="VerbatimChar"/>
+        </w:rPr>
+        <w:t xml:space="preserve">id</w:t>
+      </w:r>
+      <w:r>
+        <w:t xml:space="preserve"> </w:t>
+      </w:r>
+      <w:r>
+        <w:t xml:space="preserve">— the same</w:t>
+      </w:r>
+      <w:r>
+        <w:t xml:space="preserve"> </w:t>
+      </w:r>
+      <w:r>
+        <w:rPr>
+          <w:rStyle w:val="VerbatimChar"/>
+        </w:rPr>
+        <w:t xml:space="preserve">&lt;scenarioId&gt;.&lt;action&gt;.&lt;target&gt;</w:t>
+      </w:r>
+      <w:r>
+        <w:t xml:space="preserve"> </w:t>
+      </w:r>
+      <w:r>
+        <w:t xml:space="preserve">string</w:t>
+      </w:r>
+      <w:r>
+        <w:t xml:space="preserve"> </w:t>
+      </w:r>
+      <w:r>
+        <w:t xml:space="preserve">stored in</w:t>
+      </w:r>
+      <w:r>
+        <w:t xml:space="preserve"> </w:t>
+      </w:r>
+      <w:r>
+        <w:rPr>
+          <w:rStyle w:val="VerbatimChar"/>
+        </w:rPr>
+        <w:t xml:space="preserve">actions[].id</w:t>
+      </w:r>
+      <w:r>
+        <w:t xml:space="preserve"> </w:t>
+      </w:r>
+      <w:r>
+        <w:t xml:space="preserve">(e.g. </w:t>
+      </w:r>
+      <w:r>
+        <w:rPr>
+          <w:rStyle w:val="VerbatimChar"/>
+        </w:rPr>
+        <w:t xml:space="preserve">auth-pos-valid.click.login_button</w:t>
+      </w:r>
+      <w:r>
+        <w:t xml:space="preserve">), never an array index and never a</w:t>
+      </w:r>
+      <w:r>
+        <w:t xml:space="preserve"> </w:t>
+      </w:r>
+      <w:r>
+        <w:t xml:space="preserve">derived slug. Resolve it by plain equality (</w:t>
+      </w:r>
+      <w:r>
+        <w:rPr>
+          <w:rStyle w:val="VerbatimChar"/>
+        </w:rPr>
+        <w:t xml:space="preserve">node.actions.find(a =&gt; a.id === afterAction)</w:t>
+      </w:r>
+      <w:r>
+        <w:t xml:space="preserve">), so</w:t>
+      </w:r>
+      <w:r>
+        <w:t xml:space="preserve"> </w:t>
+      </w:r>
+      <w:r>
+        <w:t xml:space="preserve">“</w:t>
+      </w:r>
+      <w:r>
+        <w:t xml:space="preserve">the check</w:t>
+      </w:r>
+      <w:r>
+        <w:t xml:space="preserve"> </w:t>
+      </w:r>
+      <w:r>
+        <w:t xml:space="preserve">after the Login click</w:t>
+      </w:r>
+      <w:r>
+        <w:t xml:space="preserve">”</w:t>
+      </w:r>
+      <w:r>
+        <w:t xml:space="preserve"> </w:t>
+      </w:r>
+      <w:r>
+        <w:t xml:space="preserve">keeps resolving to the same step even when actions are reordered or a step is</w:t>
+      </w:r>
+      <w:r>
+        <w:t xml:space="preserve"> </w:t>
+      </w:r>
+      <w:r>
+        <w:t xml:space="preserve">inserted. Because both sides are the one identity, the join needs no helper and no computation. This is what lets Replay, Healing, the execution timeline, and root-cause explanations say</w:t>
+      </w:r>
+      <w:r>
+        <w:t xml:space="preserve"> </w:t>
+      </w:r>
+      <w:r>
+        <w:rPr>
+          <w:iCs/>
+          <w:i/>
+        </w:rPr>
+        <w:t xml:space="preserve">“</w:t>
+      </w:r>
+      <w:r>
+        <w:rPr>
+          <w:iCs/>
+          <w:i/>
+        </w:rPr>
+        <w:t xml:space="preserve">after clicking Login, expected the inventory page, but stayed on Login</w:t>
+      </w:r>
+      <w:r>
+        <w:rPr>
+          <w:iCs/>
+          <w:i/>
+        </w:rPr>
+        <w:t xml:space="preserve">”</w:t>
+      </w:r>
+      <w:r>
+        <w:t xml:space="preserve"> </w:t>
+      </w:r>
+      <w:r>
+        <w:t xml:space="preserve">instead of a bare</w:t>
+      </w:r>
+      <w:r>
+        <w:t xml:space="preserve"> </w:t>
+      </w:r>
+      <w:r>
+        <w:t xml:space="preserve">“</w:t>
+      </w:r>
+      <w:r>
+        <w:t xml:space="preserve">assertion</w:t>
+      </w:r>
+      <w:r>
+        <w:t xml:space="preserve"> </w:t>
+      </w:r>
+      <w:r>
+        <w:t xml:space="preserve">failed</w:t>
+      </w:r>
+      <w:r>
+        <w:t xml:space="preserve">”</w:t>
+      </w:r>
+      <w:r>
+        <w:t xml:space="preserve"> </w:t>
+      </w:r>
+      <w:r>
+        <w:t xml:space="preserve">— a step → outcome link with zero runtime search. The KB (the authority on the sequence) authors it</w:t>
+      </w:r>
+      <w:r>
+        <w:t xml:space="preserve"> </w:t>
+      </w:r>
+      <w:r>
+        <w:t xml:space="preserve">and the builder copies it verbatim; it is omitted when a check is not tied to a materialized step.</w:t>
       </w:r>
     </w:p>
     <w:p>
@@ -4708,19 +5095,70 @@
           <w:bCs/>
           <w:b/>
         </w:rPr>
-        <w:t xml:space="preserve">Every shared-node field serves ≥2 consumers.</w:t>
-      </w:r>
-      <w:r>
-        <w:t xml:space="preserve"> </w:t>
-      </w:r>
-      <w:r>
-        <w:t xml:space="preserve">Single-consumer data belongs in that consumer, not on</w:t>
-      </w:r>
-      <w:r>
-        <w:t xml:space="preserve"> </w:t>
-      </w:r>
-      <w:r>
-        <w:t xml:space="preserve">the node. The graph is a contract, not a junk drawer.</w:t>
+        <w:t xml:space="preserve">Assertions store CANONICAL business meaning, never Playwright.</w:t>
+      </w:r>
+      <w:r>
+        <w:t xml:space="preserve"> </w:t>
+      </w:r>
+      <w:r>
+        <w:t xml:space="preserve">The graph holds</w:t>
+      </w:r>
+      <w:r>
+        <w:t xml:space="preserve"> </w:t>
+      </w:r>
+      <w:r>
+        <w:rPr>
+          <w:rStyle w:val="VerbatimChar"/>
+        </w:rPr>
+        <w:t xml:space="preserve">{type:"visible",   target:"login_error"}</w:t>
+      </w:r>
+      <w:r>
+        <w:t xml:space="preserve">, never</w:t>
+      </w:r>
+      <w:r>
+        <w:t xml:space="preserve"> </w:t>
+      </w:r>
+      <w:r>
+        <w:rPr>
+          <w:rStyle w:val="VerbatimChar"/>
+        </w:rPr>
+        <w:t xml:space="preserve">expect(...)</w:t>
+      </w:r>
+      <w:r>
+        <w:t xml:space="preserve">,</w:t>
+      </w:r>
+      <w:r>
+        <w:t xml:space="preserve"> </w:t>
+      </w:r>
+      <w:r>
+        <w:rPr>
+          <w:rStyle w:val="VerbatimChar"/>
+        </w:rPr>
+        <w:t xml:space="preserve">toBeVisible()</w:t>
+      </w:r>
+      <w:r>
+        <w:t xml:space="preserve">, or a CSS locator. Script Gen is a pure</w:t>
+      </w:r>
+      <w:r>
+        <w:t xml:space="preserve"> </w:t>
+      </w:r>
+      <w:r>
+        <w:rPr>
+          <w:rStyle w:val="VerbatimChar"/>
+        </w:rPr>
+        <w:t xml:space="preserve">switch(type)</w:t>
+      </w:r>
+      <w:r>
+        <w:t xml:space="preserve"> </w:t>
+      </w:r>
+      <w:r>
+        <w:t xml:space="preserve">renderer + resolver — it NEVER infers an assertion from prose. The KB authors the check;</w:t>
+      </w:r>
+      <w:r>
+        <w:t xml:space="preserve"> </w:t>
+      </w:r>
+      <w:r>
+        <w:t xml:space="preserve">the graph carries it; the renderer grounds and emits it.</w:t>
       </w:r>
     </w:p>
     <w:p>
@@ -4736,6 +5174,34 @@
           <w:bCs/>
           <w:b/>
         </w:rPr>
+        <w:t xml:space="preserve">Every shared-node field serves ≥2 consumers.</w:t>
+      </w:r>
+      <w:r>
+        <w:t xml:space="preserve"> </w:t>
+      </w:r>
+      <w:r>
+        <w:t xml:space="preserve">Single-consumer data belongs in that consumer, not on</w:t>
+      </w:r>
+      <w:r>
+        <w:t xml:space="preserve"> </w:t>
+      </w:r>
+      <w:r>
+        <w:t xml:space="preserve">the node. The graph is a contract, not a junk drawer.</w:t>
+      </w:r>
+    </w:p>
+    <w:p>
+      <w:pPr>
+        <w:numPr>
+          <w:ilvl w:val="0"/>
+          <w:numId w:val="1002"/>
+        </w:numPr>
+        <w:pStyle w:val="Compact"/>
+      </w:pPr>
+      <w:r>
+        <w:rPr>
+          <w:bCs/>
+          <w:b/>
+        </w:rPr>
         <w:t xml:space="preserve">Identity / semantics / resources / actions / assertions are immutable per scenario.</w:t>
       </w:r>
       <w:r>
@@ -4822,7 +5288,7 @@
         <w:rPr>
           <w:rStyle w:val="VerbatimChar"/>
         </w:rPr>
-        <w:t xml:space="preserve">'1.2.0'</w:t>
+        <w:t xml:space="preserve">'1.2.1'</w:t>
       </w:r>
       <w:r>
         <w:t xml:space="preserve"> </w:t>
@@ -4912,7 +5378,58 @@
         <w:t xml:space="preserve">assertions</w:t>
       </w:r>
       <w:r>
-        <w:t xml:space="preserve">) is the contract version. Bump it when the shape changes:</w:t>
+        <w:t xml:space="preserve">,</w:t>
+      </w:r>
+      <w:r>
+        <w:t xml:space="preserve"> </w:t>
+      </w:r>
+      <w:r>
+        <w:rPr>
+          <w:rStyle w:val="VerbatimChar"/>
+        </w:rPr>
+        <w:t xml:space="preserve">1.2.0</w:t>
+      </w:r>
+      <w:r>
+        <w:t xml:space="preserve"> </w:t>
+      </w:r>
+      <w:r>
+        <w:t xml:space="preserve">→</w:t>
+      </w:r>
+      <w:r>
+        <w:t xml:space="preserve"> </w:t>
+      </w:r>
+      <w:r>
+        <w:rPr>
+          <w:rStyle w:val="VerbatimChar"/>
+        </w:rPr>
+        <w:t xml:space="preserve">1.2.1</w:t>
+      </w:r>
+      <w:r>
+        <w:t xml:space="preserve"> </w:t>
+      </w:r>
+      <w:r>
+        <w:t xml:space="preserve">when the 2D.4 review added the</w:t>
+      </w:r>
+      <w:r>
+        <w:t xml:space="preserve"> </w:t>
+      </w:r>
+      <w:r>
+        <w:t xml:space="preserve">optional</w:t>
+      </w:r>
+      <w:r>
+        <w:t xml:space="preserve"> </w:t>
+      </w:r>
+      <w:r>
+        <w:rPr>
+          <w:rStyle w:val="VerbatimChar"/>
+        </w:rPr>
+        <w:t xml:space="preserve">assertions[].afterAction</w:t>
+      </w:r>
+      <w:r>
+        <w:t xml:space="preserve"> </w:t>
+      </w:r>
+      <w:r>
+        <w:t xml:space="preserve">field) is the contract version. Bump it when the shape changes:</w:t>
       </w:r>
     </w:p>
     <w:p>
@@ -4934,7 +5451,16 @@
         <w:t xml:space="preserve"> </w:t>
       </w:r>
       <w:r>
-        <w:t xml:space="preserve">— additive optional field within an existing section, backward-compatible.</w:t>
+        <w:t xml:space="preserve">— additive optional field within an existing section, backward-compatible (</w:t>
+      </w:r>
+      <w:r>
+        <w:rPr>
+          <w:rStyle w:val="VerbatimChar"/>
+        </w:rPr>
+        <w:t xml:space="preserve">afterAction</w:t>
+      </w:r>
+      <w:r>
+        <w:t xml:space="preserve">, 2D.4 review).</w:t>
       </w:r>
     </w:p>
     <w:p>

</xml_diff>